<commit_message>
dts, i2s: Release soft-reset, enable clock gate, and configure dynamic pinmuxing for external I2S playback
</commit_message>
<xml_diff>
--- a/doc/ARK1668E启动模式说明.docx
+++ b/doc/ARK1668E启动模式说明.docx
@@ -9,6 +9,11 @@
     </w:p>
     <w:p>
       <w:r>
+        <w:t>[EN] The ARK1668E boot mode is controlled by 4 pin signals: B0, B1, B2, B3.</w:t>
+      </w:r>
+    </w:p>
+    <w:p>
+      <w:r>
         <w:rPr>
           <w:rFonts w:hint="eastAsia"/>
         </w:rPr>
@@ -20,29 +25,59 @@
     </w:p>
     <w:p>
       <w:r>
+        <w:t>[EN] High 2 bits [B3:B2] — select upgrade mode:</w:t>
+      </w:r>
+    </w:p>
+    <w:p>
+      <w:r>
         <w:t>[B3:B2] 00 不升级，由低两位B1,B0来选择启动模式</w:t>
       </w:r>
     </w:p>
     <w:p>
       <w:r>
+        <w:t>[EN] [B3:B2] 00 — No upgrade; low bits [B1:B0] select boot medium</w:t>
+      </w:r>
+    </w:p>
+    <w:p>
+      <w:r>
         <w:t>[B1:B0] 00:sd1卡启动；01:USB0 HOST模式启动；10:USB0 DEVICE模式全速模式启动；11:USB0 DEVICE模式高速模式启动。</w:t>
       </w:r>
     </w:p>
     <w:p>
       <w:r>
+        <w:t>[EN]   [B1:B0] 00=SD1 boot; 01=USB0 HOST boot; 10=USB0 DEVICE full-speed boot; 11=USB0 DEVICE high-speed boot</w:t>
+      </w:r>
+    </w:p>
+    <w:p>
+      <w:r>
         <w:t>[B3:B2] 01 USB0升级</w:t>
       </w:r>
     </w:p>
     <w:p>
       <w:r>
+        <w:t>[EN] [B3:B2] 01 — Upgrade via USB0</w:t>
+      </w:r>
+    </w:p>
+    <w:p>
+      <w:r>
         <w:t>[B3:B2] 10 SD1卡升级</w:t>
       </w:r>
     </w:p>
     <w:p>
       <w:r>
+        <w:t>[EN] [B3:B2] 10 — Upgrade via SD1 card</w:t>
+      </w:r>
+    </w:p>
+    <w:p>
+      <w:r>
         <w:t>[B3:B2] 11 不升级直接启动</w:t>
       </w:r>
     </w:p>
+    <w:p>
+      <w:r>
+        <w:t>[EN] [B3:B2] 11 — Skip upgrade, boot directly</w:t>
+      </w:r>
+    </w:p>
     <w:p/>
     <w:p>
       <w:r>
@@ -57,24 +92,49 @@
     </w:p>
     <w:p>
       <w:r>
+        <w:t>[EN] Low 2 bits [B1:B0] — select boot medium (when B3:B2 = 11):</w:t>
+      </w:r>
+    </w:p>
+    <w:p>
+      <w:r>
         <w:t>[B1:B0] 00 NANDFLASH启动</w:t>
       </w:r>
     </w:p>
     <w:p>
       <w:r>
+        <w:t>[EN] [B1:B0] 00 — Boot from NAND Flash</w:t>
+      </w:r>
+    </w:p>
+    <w:p>
+      <w:r>
         <w:t>[B1:B0] 01 EMMC启动</w:t>
       </w:r>
     </w:p>
     <w:p>
       <w:r>
+        <w:t>[EN] [B1:B0] 01 — Boot from eMMC</w:t>
+      </w:r>
+    </w:p>
+    <w:p>
+      <w:r>
         <w:t>[B1:B0] 10 SPINOR启动</w:t>
       </w:r>
     </w:p>
     <w:p>
       <w:r>
+        <w:t>[EN] [B1:B0] 10 — Boot from SPI NOR Flash</w:t>
+      </w:r>
+    </w:p>
+    <w:p>
+      <w:r>
         <w:t>[B1:B0] 11 SPINAND启动</w:t>
       </w:r>
     </w:p>
+    <w:p>
+      <w:r>
+        <w:t>[EN] [B1:B0] 11 — Boot from SPI NAND Flash</w:t>
+      </w:r>
+    </w:p>
     <w:p/>
     <w:p>
       <w:r>
@@ -86,19 +146,39 @@
     </w:p>
     <w:p>
       <w:r>
+        <w:t>[EN] Common configurations:</w:t>
+      </w:r>
+    </w:p>
+    <w:p>
+      <w:r>
         <w:t>[B3:B2:B1:B0] 1100 不检测是否升级，直接从NANDFLASH启动</w:t>
       </w:r>
     </w:p>
     <w:p>
       <w:r>
+        <w:t>[EN] [B3:B2:B1:B0] 1100 — No upgrade check, boot directly from NAND Flash</w:t>
+      </w:r>
+    </w:p>
+    <w:p>
+      <w:r>
         <w:t>[B3:B2:B1:B0] 1000 检测SD1卡是否有升级文件，有则升级否则从NANDFLASH启动</w:t>
       </w:r>
     </w:p>
     <w:p>
       <w:r>
+        <w:t>[EN] [B3:B2:B1:B0] 1000 — Check SD1 for upgrade files; upgrade if found, else boot from NAND Flash</w:t>
+      </w:r>
+    </w:p>
+    <w:p>
+      <w:r>
         <w:t>[B3:B2:B1:B0] 0100 检测USB0是否有升级文件，有则升级否则从NANDFLASH启动</w:t>
       </w:r>
     </w:p>
+    <w:p>
+      <w:r>
+        <w:t>[EN] [B3:B2:B1:B0] 0100 — Check USB0 for upgrade files; upgrade if found, else boot from NAND Flash</w:t>
+      </w:r>
+    </w:p>
     <w:p/>
     <w:p>
       <w:r>
@@ -107,16 +187,31 @@
     </w:p>
     <w:p>
       <w:r>
+        <w:t>[EN] [B3:B2:B1:B0] 1101 — No upgrade check, boot directly from eMMC</w:t>
+      </w:r>
+    </w:p>
+    <w:p>
+      <w:r>
         <w:t>[B3:B2:B1:B0] 1001 检测SD1卡是否有升级文件，有则升级否则从EMMC启动</w:t>
       </w:r>
     </w:p>
     <w:p>
       <w:r>
+        <w:t>[EN] [B3:B2:B1:B0] 1001 — Check SD1 for upgrade files; upgrade if found, else boot from eMMC</w:t>
+      </w:r>
+    </w:p>
+    <w:p>
+      <w:r>
         <w:t>[B3:B2:B1:B0] 0101 检测USB0是否有升级文件，有则升级否则从EMMC启动</w:t>
       </w:r>
     </w:p>
     <w:p>
       <w:r>
+        <w:t>[EN] [B3:B2:B1:B0] 0101 — Check USB0 for upgrade files; upgrade if found, else boot from eMMC</w:t>
+      </w:r>
+    </w:p>
+    <w:p>
+      <w:r>
         <w:rPr>
           <w:rFonts w:hint="eastAsia"/>
         </w:rPr>
@@ -130,6 +225,11 @@
           <w:rFonts w:hint="eastAsia"/>
         </w:rPr>
         <w:t>开发板：</w:t>
+      </w:r>
+    </w:p>
+    <w:p>
+      <w:r>
+        <w:t>[EN] Example for the ark1668e development board:</w:t>
       </w:r>
     </w:p>
     <w:p>
@@ -184,6 +284,11 @@
     </w:p>
     <w:p>
       <w:r>
+        <w:t>[EN] The current setting is:</w:t>
+      </w:r>
+    </w:p>
+    <w:p>
+      <w:r>
         <w:rPr>
           <w:noProof/>
         </w:rPr>
@@ -244,6 +349,11 @@
           <w:rFonts w:hint="eastAsia"/>
         </w:rPr>
         <w:t>设备的分支;</w:t>
+      </w:r>
+    </w:p>
+    <w:p>
+      <w:r>
+        <w:t>[EN] Compile the eMMC device branch.</w:t>
       </w:r>
     </w:p>
     <w:p/>
@@ -300,6 +410,11 @@
     </w:p>
     <w:p>
       <w:r>
+        <w:t>[EN] The current setting is:</w:t>
+      </w:r>
+    </w:p>
+    <w:p>
+      <w:r>
         <w:rPr>
           <w:rFonts w:hint="eastAsia"/>
         </w:rPr>
@@ -371,6 +486,11 @@
           <w:rFonts w:hint="eastAsia"/>
         </w:rPr>
         <w:t>设备的分支;</w:t>
+      </w:r>
+    </w:p>
+    <w:p>
+      <w:r>
+        <w:t>[EN] Compile the eMMC device branch.</w:t>
       </w:r>
     </w:p>
     <w:sectPr>

</xml_diff>